<commit_message>
BGRE proposal rewritten as a bid, not a fee letter
Same locked fee (3f0585e10b5d); the narrative now sells: the project read as
four cost problems in one occupied tower, the five cost risks we'd manage
first, a methodology section answering the RFP's scored cost-to-complete and
early-warning questions, why-us (only claims already in the firm's own
sample: independent advisory role, crew-based database, MEP estimating team,
NYC office), proposed team with level of effort from the hours build,
phase-labelled scope, fee lines structured to the termination option.
Comparable projects and personnel left as explicit bracketed placeholders -
nothing invented.

Co-Authored-By: Claude Fable 5.1 <noreply@anthropic.com>
Claude-Session: https://claude.ai/code/session_012mP1iTukX1sv7YH1yyeg1v
</commit_message>
<xml_diff>
--- a/jobs/bgre-metrotech-cm/out/BGRE_Metrotech_Cost_Management_Fee_Proposal.docx
+++ b/jobs/bgre-metrotech-cm/out/BGRE_Metrotech_Cost_Management_Fee_Proposal.docx
@@ -329,7 +329,7 @@
           <w:sz w:val="19"/>
           <w:szCs w:val="19"/>
         </w:rPr>
-        <w:t xml:space="preserve">Thank you for the opportunity to respond to BGRE’s Request for Proposal for Owner’s Representative services for the above project. We are pleased to submit the following fee proposal for cost management services for the DCAS Fitout, Whitebox &amp; Capital Improvement project at 1 Metrotech Center.</w:t>
+        <w:t xml:space="preserve">Thank you for the opportunity to respond to BGRE’s Request for Proposal for Owner’s Representative services for the DCAS Fitout, Whitebox &amp; Capital Improvement project at 1 Metrotech Center. We are submitting this proposal for the cost management workstream of that engagement: the budget architecture, estimate and bid validation, change control, and monthly cost-to-complete reporting that will let BGRE and its investment stakeholders see the true cost position of all four asset improvements, every month, from mobilization on October 19, 2026 through closeout.</w:t>
       </w:r>
     </w:p>
     <w:p>
@@ -358,7 +358,205 @@
           <w:sz w:val="19"/>
           <w:szCs w:val="19"/>
         </w:rPr>
-        <w:t xml:space="preserve">It is our understanding that BGRE is delivering the DCAS Fitout, Whitebox &amp; Capital Improvement project at 1 Metrotech Center / 351 Jay Street, Brooklyn – approximately 840,406 RSF within an occupied 23-story office tower – comprising four asset improvements: the 100 Gold tenant demo, landlord work and fit out (approximately 589,717 RSF); demo, landlord work and whitebox of the balance of the premises (approximately 250,689 RSF); base building capital improvements front-loaded to three years; and coordination of existing tenant relocations. Design and construction are anticipated to start October 19, 2026, reaching 100% Design Development by March 15, 2027 – where the Owner holds a termination option – and running through project closeout in December 2029. This proposal responds to the cost management workstream of the RFP only: budget control, estimate and pricing review, bid leveling, change order review, and monthly cost reporting across the asset-improvement buckets.</w:t>
+        <w:t xml:space="preserve">It is our understanding that BGRE is delivering approximately 840,406 RSF of work within an occupied 23-story office tower at 1 Metrotech Center / 351 Jay Street, Brooklyn, in four asset improvements: the 100 Gold tenant demo, landlord work and fit out (approximately 589,717 RSF); demo, landlord work and whitebox of the balance of the premises (approximately 250,689 RSF); base building capital improvements front-loaded to three years; and coordination of existing tenant relocations. Design and construction start October 19, 2026; the Owner holds a termination option at 100% Design Development on March 15, 2027; the program runs through closeout in December 2029, with substantial completion in October 2029. DCAS will review the progress sets at several phases, with comments incorporated into the drawing sets, and bids will carry a 25% MWBE participation requirement across hard and soft costs.</w:t>
+      </w:r>
+    </w:p>
+    <w:p/>
+    <w:p>
+      <w:pPr>
+        <w:spacing w:line="240" w:lineRule="atLeast"/>
+        <w:rPr>
+          <w:rFonts w:ascii="Calibri Light" w:hAnsi="Calibri Light" w:cs="Calibri Light"/>
+          <w:sz w:val="19"/>
+          <w:szCs w:val="19"/>
+        </w:rPr>
+      </w:pPr>
+      <w:r>
+        <w:rPr>
+          <w:rFonts w:ascii="Calibri Light" w:hAnsi="Calibri Light" w:cs="Calibri Light"/>
+          <w:sz w:val="19"/>
+          <w:szCs w:val="19"/>
+        </w:rPr>
+        <w:t xml:space="preserve">Read as a cost problem, this is not one project but four with different economics running through one occupied building: a large tenant fit out delivered to DCAS’s standards and specification book, where each review round on the progress sets is a potential scope and cost event; a speculative whitebox of the balance of the premises, where the discipline is to build exactly what future leasing needs and no more; base-building capital improvements front-loaded into the first three years, which concentrates commitments and cash flow early; and tenant relocations whose buyout and swing-space costs sit outside the construction contracts. The cost management brief follows directly: keep the four budgets and the landlord, tenant, and capital cost classes cleanly separated from the first commitment, and give BGRE a defensible, current cost-to-complete every month – above all, a bankable per-bucket number at the 100% Design Development gate on March 15, 2027.</w:t>
+      </w:r>
+    </w:p>
+    <w:p/>
+    <w:p>
+      <w:pPr>
+        <w:spacing w:line="240" w:lineRule="atLeast"/>
+        <w:rPr>
+          <w:rFonts w:ascii="Calibri Light" w:hAnsi="Calibri Light" w:cs="Calibri Light"/>
+          <w:sz w:val="19"/>
+          <w:szCs w:val="19"/>
+        </w:rPr>
+      </w:pPr>
+      <w:r>
+        <w:rPr>
+          <w:rFonts w:ascii="Calibri Light" w:hAnsi="Calibri Light" w:cs="Calibri Light"/>
+          <w:sz w:val="19"/>
+          <w:szCs w:val="19"/>
+        </w:rPr>
+        <w:t xml:space="preserve">The cost risks we would be managing from day one:</w:t>
+      </w:r>
+    </w:p>
+    <w:p>
+      <w:pPr>
+        <w:pStyle w:val="ListParagraph"/>
+        <w:numPr>
+          <w:ilvl w:val="0"/>
+          <w:numId w:val="102"/>
+        </w:numPr>
+        <w:spacing w:line="360" w:lineRule="auto"/>
+        <w:rPr>
+          <w:rFonts w:ascii="Calibri Light" w:hAnsi="Calibri Light" w:cs="Calibri Light"/>
+          <w:sz w:val="19"/>
+          <w:szCs w:val="19"/>
+        </w:rPr>
+      </w:pPr>
+      <w:r>
+        <w:rPr>
+          <w:b/>
+          <w:rFonts w:ascii="Calibri Light" w:hAnsi="Calibri Light" w:cs="Calibri Light"/>
+          <w:sz w:val="19"/>
+          <w:szCs w:val="19"/>
+        </w:rPr>
+        <w:t xml:space="preserve">Scope drift through the DCAS comment cycle. </w:t>
+      </w:r>
+      <w:r>
+        <w:rPr>
+          <w:rFonts w:ascii="Calibri Light" w:hAnsi="Calibri Light" w:cs="Calibri Light"/>
+          <w:sz w:val="19"/>
+          <w:szCs w:val="19"/>
+        </w:rPr>
+        <w:t xml:space="preserve">Every round of DCAS comments incorporated into the progress sets moves cost. We price the cost effect of each issuance so the budget never lags the drawings, and BGRE sees the trend before 100% DD, not after.</w:t>
+      </w:r>
+    </w:p>
+    <w:p>
+      <w:pPr>
+        <w:pStyle w:val="ListParagraph"/>
+        <w:numPr>
+          <w:ilvl w:val="0"/>
+          <w:numId w:val="102"/>
+        </w:numPr>
+        <w:spacing w:line="360" w:lineRule="auto"/>
+        <w:rPr>
+          <w:rFonts w:ascii="Calibri Light" w:hAnsi="Calibri Light" w:cs="Calibri Light"/>
+          <w:sz w:val="19"/>
+          <w:szCs w:val="19"/>
+        </w:rPr>
+      </w:pPr>
+      <w:r>
+        <w:rPr>
+          <w:b/>
+          <w:rFonts w:ascii="Calibri Light" w:hAnsi="Calibri Light" w:cs="Calibri Light"/>
+          <w:sz w:val="19"/>
+          <w:szCs w:val="19"/>
+        </w:rPr>
+        <w:t xml:space="preserve">Landlord / tenant / capital cost segregation. </w:t>
+      </w:r>
+      <w:r>
+        <w:rPr>
+          <w:rFonts w:ascii="Calibri Light" w:hAnsi="Calibri Light" w:cs="Calibri Light"/>
+          <w:sz w:val="19"/>
+          <w:szCs w:val="19"/>
+        </w:rPr>
+        <w:t xml:space="preserve">With tenant fit out, landlord work, whitebox, and base-building capital in one program, every commitment must be coded to the right bucket and cost class at source, or the lease economics and the capital plan both lose their audit trail.</w:t>
+      </w:r>
+    </w:p>
+    <w:p>
+      <w:pPr>
+        <w:pStyle w:val="ListParagraph"/>
+        <w:numPr>
+          <w:ilvl w:val="0"/>
+          <w:numId w:val="102"/>
+        </w:numPr>
+        <w:spacing w:line="360" w:lineRule="auto"/>
+        <w:rPr>
+          <w:rFonts w:ascii="Calibri Light" w:hAnsi="Calibri Light" w:cs="Calibri Light"/>
+          <w:sz w:val="19"/>
+          <w:szCs w:val="19"/>
+        </w:rPr>
+      </w:pPr>
+      <w:r>
+        <w:rPr>
+          <w:b/>
+          <w:rFonts w:ascii="Calibri Light" w:hAnsi="Calibri Light" w:cs="Calibri Light"/>
+          <w:sz w:val="19"/>
+          <w:szCs w:val="19"/>
+        </w:rPr>
+        <w:t xml:space="preserve">Occupied-building general conditions. </w:t>
+      </w:r>
+      <w:r>
+        <w:rPr>
+          <w:rFonts w:ascii="Calibri Light" w:hAnsi="Calibri Light" w:cs="Calibri Light"/>
+          <w:sz w:val="19"/>
+          <w:szCs w:val="19"/>
+        </w:rPr>
+        <w:t xml:space="preserve">Logistics, off-hours work, hoisting, protection, and garage operations are where contractor pricing hides margin. We scrutinize general conditions and logistics line by line in bid leveling and in every change order.</w:t>
+      </w:r>
+    </w:p>
+    <w:p>
+      <w:pPr>
+        <w:pStyle w:val="ListParagraph"/>
+        <w:numPr>
+          <w:ilvl w:val="0"/>
+          <w:numId w:val="102"/>
+        </w:numPr>
+        <w:spacing w:line="360" w:lineRule="auto"/>
+        <w:rPr>
+          <w:rFonts w:ascii="Calibri Light" w:hAnsi="Calibri Light" w:cs="Calibri Light"/>
+          <w:sz w:val="19"/>
+          <w:szCs w:val="19"/>
+        </w:rPr>
+      </w:pPr>
+      <w:r>
+        <w:rPr>
+          <w:b/>
+          <w:rFonts w:ascii="Calibri Light" w:hAnsi="Calibri Light" w:cs="Calibri Light"/>
+          <w:sz w:val="19"/>
+          <w:szCs w:val="19"/>
+        </w:rPr>
+        <w:t xml:space="preserve">Front-loaded capital. </w:t>
+      </w:r>
+      <w:r>
+        <w:rPr>
+          <w:rFonts w:ascii="Calibri Light" w:hAnsi="Calibri Light" w:cs="Calibri Light"/>
+          <w:sz w:val="19"/>
+          <w:szCs w:val="19"/>
+        </w:rPr>
+        <w:t xml:space="preserve">Base-building improvements committed early set the program’s cash-flow curve; the forecast must show commitments against timing, not just totals.</w:t>
+      </w:r>
+    </w:p>
+    <w:p>
+      <w:pPr>
+        <w:pStyle w:val="ListParagraph"/>
+        <w:numPr>
+          <w:ilvl w:val="0"/>
+          <w:numId w:val="102"/>
+        </w:numPr>
+        <w:spacing w:line="360" w:lineRule="auto"/>
+        <w:rPr>
+          <w:rFonts w:ascii="Calibri Light" w:hAnsi="Calibri Light" w:cs="Calibri Light"/>
+          <w:sz w:val="19"/>
+          <w:szCs w:val="19"/>
+        </w:rPr>
+      </w:pPr>
+      <w:r>
+        <w:rPr>
+          <w:b/>
+          <w:rFonts w:ascii="Calibri Light" w:hAnsi="Calibri Light" w:cs="Calibri Light"/>
+          <w:sz w:val="19"/>
+          <w:szCs w:val="19"/>
+        </w:rPr>
+        <w:t xml:space="preserve">The 100% DD termination gate. </w:t>
+      </w:r>
+      <w:r>
+        <w:rPr>
+          <w:rFonts w:ascii="Calibri Light" w:hAnsi="Calibri Light" w:cs="Calibri Light"/>
+          <w:sz w:val="19"/>
+          <w:szCs w:val="19"/>
+        </w:rPr>
+        <w:t xml:space="preserve">BGRE’s decision on March 15, 2027 deserves a reconciled per-bucket budget with contingency and escalation shown explicitly. Phase 1 of our fee is built to deliver exactly that.</w:t>
       </w:r>
     </w:p>
     <w:p>
@@ -680,12 +878,22 @@
       </w:pPr>
       <w:r>
         <w:rPr>
+          <w:b/>
           <w:rStyle w:val="normaltextrun"/>
           <w:rFonts w:ascii="Calibri Light" w:hAnsi="Calibri Light" w:cs="Calibri Light"/>
           <w:sz w:val="19"/>
           <w:szCs w:val="19"/>
         </w:rPr>
-        <w:t xml:space="preserve">Our cost management approach keeps one current, auditable picture of the program’s cost position at all times: every commitment, exposure, allowance, and contingency draw is visible in the monthly cost report, and the cost-to-complete forecast is refreshed each month so decisions are made against the latest position rather than the last budget. Allowances, markups, escalation, and premiums are shown as separately identified lines, so the numbers remain transparent and auditable throughout the program.</w:t>
+        <w:t xml:space="preserve">Cost architecture. </w:t>
+      </w:r>
+      <w:r>
+        <w:rPr>
+          <w:rStyle w:val="normaltextrun"/>
+          <w:rFonts w:ascii="Calibri Light" w:hAnsi="Calibri Light" w:cs="Calibri Light"/>
+          <w:sz w:val="19"/>
+          <w:szCs w:val="19"/>
+        </w:rPr>
+        <w:t xml:space="preserve">At mobilization we establish one work breakdown structure and cost-code set for the entire program, keyed to the four asset-improvement buckets and to the landlord work, tenant fit out, whitebox, and base-building capital cost classes within them. Every budget line, commitment, invoice, change, and contingency draw is coded at source, so per-bucket reporting is a filter on one dataset rather than four spreadsheets reconciled by hand – and the audit trail the RFP asks for is a by-product of the system, not a separate effort.</w:t>
       </w:r>
     </w:p>
     <w:p>
@@ -713,34 +921,145 @@
       </w:pPr>
       <w:r>
         <w:rPr>
+          <w:b/>
           <w:rStyle w:val="normaltextrun"/>
           <w:rFonts w:ascii="Calibri Light" w:hAnsi="Calibri Light" w:cs="Calibri Light"/>
           <w:sz w:val="19"/>
           <w:szCs w:val="19"/>
         </w:rPr>
-        <w:t xml:space="preserve">For this assignment, cost control is the discipline that holds a four-bucket, multi-year program together: one WBS and cost-code structure across the buckets from day one; a single consolidated monthly cost report with per-bucket breakouts; a current cost-to-complete forecast maintained every month, so emerging budget pressure is visible before it becomes material; and disciplined change and contingency tracking from the first commitment to final reconciliation. Because the engagement spans more than three years, the fee is priced on escalated rates by contract year rather than flat year-one rates, and it is severable at the Owner’s 100% Design Development termination option.</w:t>
-      </w:r>
-    </w:p>
-    <w:p>
-      <w:pPr>
-        <w:spacing w:line="240" w:lineRule="atLeast"/>
-        <w:rPr>
-          <w:rFonts w:ascii="Calibri Light" w:hAnsi="Calibri Light" w:cs="Calibri Light"/>
-          <w:sz w:val="19"/>
-          <w:szCs w:val="19"/>
-        </w:rPr>
-      </w:pPr>
-    </w:p>
-    <w:p>
-      <w:pPr>
-        <w:spacing w:line="240" w:lineRule="atLeast"/>
-        <w:rPr>
-          <w:rFonts w:ascii="Calibri Light" w:hAnsi="Calibri Light" w:cs="Calibri Light"/>
-          <w:sz w:val="19"/>
-          <w:szCs w:val="19"/>
-        </w:rPr>
-      </w:pPr>
-    </w:p>
+        <w:t xml:space="preserve">Maintaining a current cost-to-complete. </w:t>
+      </w:r>
+      <w:r>
+        <w:rPr>
+          <w:rStyle w:val="normaltextrun"/>
+          <w:rFonts w:ascii="Calibri Light" w:hAnsi="Calibri Light" w:cs="Calibri Light"/>
+          <w:sz w:val="19"/>
+          <w:szCs w:val="19"/>
+        </w:rPr>
+        <w:t xml:space="preserve">Our monthly cost report carries, for each bucket and for the program: original budget, approved changes, current budget, commitments, invoiced to date, approved change orders, pending changes, forecast cost to complete, and variance to budget. The forecast is rebuilt every month from the bottom – open commitments, pending and potential changes, remaining allowances, and contingency – rather than rolled forward. Pending changes are carried as exposures from the moment they are identified, not when they are approved, and contingency is tracked as a drawdown curve against remaining scope and time.</w:t>
+      </w:r>
+    </w:p>
+    <w:p/>
+    <w:p>
+      <w:pPr>
+        <w:spacing w:line="240" w:lineRule="atLeast"/>
+        <w:outlineLvl w:val="0"/>
+        <w:rPr>
+          <w:rFonts w:ascii="Calibri Light" w:hAnsi="Calibri Light" w:cs="Calibri Light"/>
+          <w:bCs/>
+          <w:sz w:val="19"/>
+          <w:szCs w:val="19"/>
+        </w:rPr>
+      </w:pPr>
+      <w:r>
+        <w:rPr>
+          <w:b/>
+          <w:rFonts w:ascii="Calibri Light" w:hAnsi="Calibri Light" w:cs="Calibri Light"/>
+          <w:sz w:val="19"/>
+          <w:szCs w:val="19"/>
+        </w:rPr>
+        <w:t xml:space="preserve">Identifying budget pressure before it becomes material. </w:t>
+      </w:r>
+      <w:r>
+        <w:rPr>
+          <w:rFonts w:ascii="Calibri Light" w:hAnsi="Calibri Light" w:cs="Calibri Light"/>
+          <w:sz w:val="19"/>
+          <w:szCs w:val="19"/>
+        </w:rPr>
+        <w:t xml:space="preserve">Three signals are trended month over month: the pending and potential change pipeline against remaining contingency; the rate of contingency drawdown against percent complete; and unit-cost movement against the baseline – cost per RSF by bucket, general conditions as a percentage of trade cost, and change orders as a percentage of contract value. When any of these moves, the monthly narrative says so explicitly, distinguishing facts, risks, and decisions required of the Owner, in the format the RFP calls for.</w:t>
+      </w:r>
+    </w:p>
+    <w:p/>
+    <w:p>
+      <w:pPr>
+        <w:spacing w:line="240" w:lineRule="atLeast"/>
+        <w:outlineLvl w:val="0"/>
+        <w:rPr>
+          <w:rFonts w:ascii="Calibri Light" w:hAnsi="Calibri Light" w:cs="Calibri Light"/>
+          <w:bCs/>
+          <w:sz w:val="19"/>
+          <w:szCs w:val="19"/>
+        </w:rPr>
+      </w:pPr>
+      <w:r>
+        <w:rPr>
+          <w:b/>
+          <w:rFonts w:ascii="Calibri Light" w:hAnsi="Calibri Light" w:cs="Calibri Light"/>
+          <w:sz w:val="19"/>
+          <w:szCs w:val="19"/>
+        </w:rPr>
+        <w:t xml:space="preserve">Estimate and bid validation. </w:t>
+      </w:r>
+      <w:r>
+        <w:rPr>
+          <w:rFonts w:ascii="Calibri Light" w:hAnsi="Calibri Light" w:cs="Calibri Light"/>
+          <w:sz w:val="19"/>
+          <w:szCs w:val="19"/>
+        </w:rPr>
+        <w:t xml:space="preserve">Design-stage estimates and contractor pricing are checked against our first-principles, crew-based database of current local labor rates, material and equipment pricing, and subcontractor markups, with our specialized MEP cost estimating team reviewing the mechanical, electrical, and plumbing scope where fit-out and base-building capital costs overlap. In bid leveling we reconcile scope as well as price: exclusions, qualifications, allowances, general conditions, and logistics are normalized across bidders before a recommendation is made, and MWBE participation is carried as a leveled column alongside price.</w:t>
+      </w:r>
+    </w:p>
+    <w:p/>
+    <w:p>
+      <w:pPr>
+        <w:spacing w:line="240" w:lineRule="atLeast"/>
+        <w:outlineLvl w:val="0"/>
+        <w:rPr>
+          <w:rFonts w:ascii="Calibri Light" w:hAnsi="Calibri Light" w:cs="Calibri Light"/>
+          <w:bCs/>
+          <w:sz w:val="19"/>
+          <w:szCs w:val="19"/>
+        </w:rPr>
+      </w:pPr>
+      <w:r>
+        <w:rPr>
+          <w:b/>
+          <w:rFonts w:ascii="Calibri Light" w:hAnsi="Calibri Light" w:cs="Calibri Light"/>
+          <w:sz w:val="19"/>
+          <w:szCs w:val="19"/>
+        </w:rPr>
+        <w:t xml:space="preserve">Change control. </w:t>
+      </w:r>
+      <w:r>
+        <w:rPr>
+          <w:rFonts w:ascii="Calibri Light" w:hAnsi="Calibri Light" w:cs="Calibri Light"/>
+          <w:sz w:val="19"/>
+          <w:szCs w:val="19"/>
+        </w:rPr>
+        <w:t xml:space="preserve">Every proposed change is reviewed for entitlement under the contract, pricing against contract unit rates and our database, schedule implication, and alternatives, and is logged with its cumulative effect on the bucket and the program. No change reaches BGRE for approval without scope, cost, funding source, and a recommendation – the standard the RFP sets.</w:t>
+      </w:r>
+    </w:p>
+    <w:p/>
+    <w:p>
+      <w:pPr>
+        <w:spacing w:line="240" w:lineRule="atLeast"/>
+        <w:outlineLvl w:val="0"/>
+        <w:rPr>
+          <w:rFonts w:ascii="Calibri Light" w:hAnsi="Calibri Light" w:cs="Calibri Light"/>
+          <w:bCs/>
+          <w:sz w:val="19"/>
+          <w:szCs w:val="19"/>
+        </w:rPr>
+      </w:pPr>
+      <w:r>
+        <w:rPr>
+          <w:b/>
+          <w:rFonts w:ascii="Calibri Light" w:hAnsi="Calibri Light" w:cs="Calibri Light"/>
+          <w:sz w:val="19"/>
+          <w:szCs w:val="19"/>
+        </w:rPr>
+        <w:t xml:space="preserve">Reporting for investment stakeholders. </w:t>
+      </w:r>
+      <w:r>
+        <w:rPr>
+          <w:rFonts w:ascii="Calibri Light" w:hAnsi="Calibri Light" w:cs="Calibri Light"/>
+          <w:sz w:val="19"/>
+          <w:szCs w:val="19"/>
+        </w:rPr>
+        <w:t xml:space="preserve">The monthly package is a one-page executive cost summary on top of the detailed cost report, in a consistent format month to month, so asset management and investment stakeholders can read the trend without re-learning the report. Our cost management tools are included in the fee, with full Owner access to the data.</w:t>
+      </w:r>
+    </w:p>
+    <w:p/>
     <w:p>
       <w:pPr>
         <w:spacing w:line="240" w:lineRule="atLeast"/>
@@ -758,6 +1077,172 @@
           <w:sz w:val="19"/>
           <w:szCs w:val="19"/>
         </w:rPr>
+        <w:t xml:space="preserve">WHY CUMMING FOR THIS ASSIGNMENT</w:t>
+      </w:r>
+    </w:p>
+    <w:p/>
+    <w:p>
+      <w:pPr>
+        <w:spacing w:line="240" w:lineRule="atLeast"/>
+        <w:outlineLvl w:val="0"/>
+        <w:rPr>
+          <w:rFonts w:ascii="Calibri Light" w:hAnsi="Calibri Light" w:cs="Calibri Light"/>
+          <w:bCs/>
+          <w:sz w:val="19"/>
+          <w:szCs w:val="19"/>
+        </w:rPr>
+      </w:pPr>
+      <w:r>
+        <w:rPr>
+          <w:rFonts w:ascii="Calibri Light" w:hAnsi="Calibri Light" w:cs="Calibri Light"/>
+          <w:sz w:val="19"/>
+          <w:szCs w:val="19"/>
+        </w:rPr>
+        <w:t xml:space="preserve">Cumming acts solely as an advisory consultant to the Owner. We carry no contractor, design, or vendor interest in this project, so our validation of estimates, bids, and change orders is independent by construction, and our recommendations are made in BGRE’s commercial interest alone.</w:t>
+      </w:r>
+    </w:p>
+    <w:p/>
+    <w:p>
+      <w:pPr>
+        <w:spacing w:line="240" w:lineRule="atLeast"/>
+        <w:outlineLvl w:val="0"/>
+        <w:rPr>
+          <w:rFonts w:ascii="Calibri Light" w:hAnsi="Calibri Light" w:cs="Calibri Light"/>
+          <w:bCs/>
+          <w:sz w:val="19"/>
+          <w:szCs w:val="19"/>
+        </w:rPr>
+      </w:pPr>
+      <w:r>
+        <w:rPr>
+          <w:rFonts w:ascii="Calibri Light" w:hAnsi="Calibri Light" w:cs="Calibri Light"/>
+          <w:sz w:val="19"/>
+          <w:szCs w:val="19"/>
+        </w:rPr>
+        <w:t xml:space="preserve">Cost management is a core practice at Cumming, delivered by a dedicated cost management team. The crew-based estimating database, current local labor and market pricing, and specialized MEP cost estimating team described above are the same resources we bring to milestone estimating, and they are what allow us to challenge a contractor’s number line by line rather than accept it. Our New York office at 151 West 42nd Street puts the team within easy reach of 1 Metrotech Center whenever presence on site is useful.</w:t>
+      </w:r>
+    </w:p>
+    <w:p/>
+    <w:p>
+      <w:pPr>
+        <w:spacing w:line="240" w:lineRule="atLeast"/>
+        <w:outlineLvl w:val="0"/>
+        <w:rPr>
+          <w:rFonts w:ascii="Calibri Light" w:hAnsi="Calibri Light" w:cs="Calibri Light"/>
+          <w:bCs/>
+          <w:sz w:val="19"/>
+          <w:szCs w:val="19"/>
+        </w:rPr>
+      </w:pPr>
+      <w:r>
+        <w:rPr>
+          <w:rFonts w:ascii="Calibri Light" w:hAnsi="Calibri Light" w:cs="Calibri Light"/>
+          <w:sz w:val="19"/>
+          <w:szCs w:val="19"/>
+        </w:rPr>
+        <w:t xml:space="preserve">[Insert two to three comparable engagements – occupied-building tenant fit out, whitebox, and base-building capital programs of similar scale – with client, property, size, total project cost, scope, duration, team members, status, and reference, per RFP Section 7.2. Do not send without completing or deleting this paragraph.]</w:t>
+      </w:r>
+    </w:p>
+    <w:p/>
+    <w:p>
+      <w:pPr>
+        <w:spacing w:line="240" w:lineRule="atLeast"/>
+        <w:rPr>
+          <w:rFonts w:asciiTheme="majorHAnsi" w:hAnsiTheme="majorHAnsi" w:cstheme="majorHAnsi"/>
+          <w:color w:val="953634"/>
+          <w:sz w:val="19"/>
+          <w:szCs w:val="19"/>
+        </w:rPr>
+      </w:pPr>
+      <w:r>
+        <w:rPr>
+          <w:rFonts w:asciiTheme="majorHAnsi" w:hAnsiTheme="majorHAnsi" w:cstheme="majorHAnsi"/>
+          <w:color w:val="953634"/>
+          <w:sz w:val="19"/>
+          <w:szCs w:val="19"/>
+        </w:rPr>
+        <w:t xml:space="preserve">PROPOSED TEAM</w:t>
+      </w:r>
+    </w:p>
+    <w:p/>
+    <w:p>
+      <w:pPr>
+        <w:spacing w:line="240" w:lineRule="atLeast"/>
+        <w:outlineLvl w:val="0"/>
+        <w:rPr>
+          <w:rFonts w:ascii="Calibri Light" w:hAnsi="Calibri Light" w:cs="Calibri Light"/>
+          <w:bCs/>
+          <w:sz w:val="19"/>
+          <w:szCs w:val="19"/>
+        </w:rPr>
+      </w:pPr>
+      <w:r>
+        <w:rPr>
+          <w:rFonts w:ascii="Calibri Light" w:hAnsi="Calibri Light" w:cs="Calibri Light"/>
+          <w:sz w:val="19"/>
+          <w:szCs w:val="19"/>
+        </w:rPr>
+        <w:t xml:space="preserve">The cost workstream is led by a Director-level cost manager as BGRE’s single point of accountability for the numbers, supported by a Senior Cost Manager who carries the monthly reporting, forecasting, and pricing reviews, a Cost Manager who maintains the logs and assembles the reports, and a Vice President providing principal oversight and attending the monthly owner cost meeting. Anticipated level of effort is approximately 440 hours across the team through 100% Design Development (roughly 88 hours per month) and approximately 1,270 hours from construction through closeout (roughly 38 hours per month), approximately 1,700 hours over the term. Key personnel remain assigned for the duration of the engagement; any substitution will be subject to BGRE’s approval, as the RFP requires.</w:t>
+      </w:r>
+    </w:p>
+    <w:p/>
+    <w:p>
+      <w:pPr>
+        <w:spacing w:line="240" w:lineRule="atLeast"/>
+        <w:outlineLvl w:val="0"/>
+        <w:rPr>
+          <w:rFonts w:ascii="Calibri Light" w:hAnsi="Calibri Light" w:cs="Calibri Light"/>
+          <w:bCs/>
+          <w:sz w:val="19"/>
+          <w:szCs w:val="19"/>
+        </w:rPr>
+      </w:pPr>
+      <w:r>
+        <w:rPr>
+          <w:rFonts w:ascii="Calibri Light" w:hAnsi="Calibri Light" w:cs="Calibri Light"/>
+          <w:sz w:val="19"/>
+          <w:szCs w:val="19"/>
+        </w:rPr>
+        <w:t xml:space="preserve">[Insert name, title, office location, role, years of relevant experience, relevant projects, qualifications, availability, and percentage of time dedicated for the Director, Senior Cost Manager, Cost Manager, and Vice President, with the organizational chart, per RFP Section 6. Do not send without completing or deleting this paragraph.]</w:t>
+      </w:r>
+    </w:p>
+    <w:p>
+      <w:pPr>
+        <w:spacing w:line="240" w:lineRule="atLeast"/>
+        <w:rPr>
+          <w:rFonts w:ascii="Calibri Light" w:hAnsi="Calibri Light" w:cs="Calibri Light"/>
+          <w:sz w:val="19"/>
+          <w:szCs w:val="19"/>
+        </w:rPr>
+      </w:pPr>
+    </w:p>
+    <w:p>
+      <w:pPr>
+        <w:spacing w:line="240" w:lineRule="atLeast"/>
+        <w:rPr>
+          <w:rFonts w:ascii="Calibri Light" w:hAnsi="Calibri Light" w:cs="Calibri Light"/>
+          <w:sz w:val="19"/>
+          <w:szCs w:val="19"/>
+        </w:rPr>
+      </w:pPr>
+    </w:p>
+    <w:p>
+      <w:pPr>
+        <w:spacing w:line="240" w:lineRule="atLeast"/>
+        <w:rPr>
+          <w:rFonts w:asciiTheme="majorHAnsi" w:hAnsiTheme="majorHAnsi" w:cstheme="majorHAnsi"/>
+          <w:color w:val="953634"/>
+          <w:sz w:val="19"/>
+          <w:szCs w:val="19"/>
+        </w:rPr>
+      </w:pPr>
+      <w:r>
+        <w:rPr>
+          <w:rFonts w:asciiTheme="majorHAnsi" w:hAnsiTheme="majorHAnsi" w:cstheme="majorHAnsi"/>
+          <w:color w:val="953634"/>
+          <w:sz w:val="19"/>
+          <w:szCs w:val="19"/>
+        </w:rPr>
         <w:t>SCOPE OF SERVICES</w:t>
       </w:r>
     </w:p>
@@ -786,7 +1271,7 @@
           <w:sz w:val="19"/>
           <w:szCs w:val="19"/>
         </w:rPr>
-        <w:t>Our fee covers the following scope of services</w:t>
+        <w:t xml:space="preserve">Our fee covers the following scope of cost management services, structured to the Owner’s termination option:</w:t>
       </w:r>
     </w:p>
     <w:p>
@@ -815,11 +1300,20 @@
       </w:pPr>
       <w:r>
         <w:rPr>
-          <w:rFonts w:ascii="Calibri Light" w:hAnsi="Calibri Light" w:cs="Calibri Light"/>
-          <w:sz w:val="19"/>
-          <w:szCs w:val="19"/>
-        </w:rPr>
-        <w:t xml:space="preserve">Mobilization: cost-control framework, WBS and cost codes by asset-improvement bucket, report formats, and control procedures</w:t>
+          <w:b/>
+          <w:rFonts w:ascii="Calibri Light" w:hAnsi="Calibri Light" w:cs="Calibri Light"/>
+          <w:sz w:val="19"/>
+          <w:szCs w:val="19"/>
+        </w:rPr>
+        <w:t xml:space="preserve">Phase 1 – </w:t>
+      </w:r>
+      <w:r>
+        <w:rPr>
+          <w:rFonts w:ascii="Calibri Light" w:hAnsi="Calibri Light" w:cs="Calibri Light"/>
+          <w:sz w:val="19"/>
+          <w:szCs w:val="19"/>
+        </w:rPr>
+        <w:t xml:space="preserve">Mobilization: cost-control framework, WBS and cost codes by bucket and cost class, report formats, and change and contingency procedures, agreed with BGRE within the first two weeks.</w:t>
       </w:r>
     </w:p>
     <w:p>
@@ -838,11 +1332,20 @@
       </w:pPr>
       <w:r>
         <w:rPr>
-          <w:rFonts w:ascii="Calibri Light" w:hAnsi="Calibri Light" w:cs="Calibri Light"/>
-          <w:sz w:val="19"/>
-          <w:szCs w:val="19"/>
-        </w:rPr>
-        <w:t xml:space="preserve">Baseline budget establishment and validation across the four asset-improvement buckets</w:t>
+          <w:b/>
+          <w:rFonts w:ascii="Calibri Light" w:hAnsi="Calibri Light" w:cs="Calibri Light"/>
+          <w:sz w:val="19"/>
+          <w:szCs w:val="19"/>
+        </w:rPr>
+        <w:t xml:space="preserve">Phase 1 – </w:t>
+      </w:r>
+      <w:r>
+        <w:rPr>
+          <w:rFonts w:ascii="Calibri Light" w:hAnsi="Calibri Light" w:cs="Calibri Light"/>
+          <w:sz w:val="19"/>
+          <w:szCs w:val="19"/>
+        </w:rPr>
+        <w:t xml:space="preserve">Baseline budget establishment and validation for each of the four asset-improvement buckets, with contingency and escalation shown explicitly.</w:t>
       </w:r>
     </w:p>
     <w:p>
@@ -861,11 +1364,20 @@
       </w:pPr>
       <w:r>
         <w:rPr>
-          <w:rFonts w:ascii="Calibri Light" w:hAnsi="Calibri Light" w:cs="Calibri Light"/>
-          <w:sz w:val="19"/>
-          <w:szCs w:val="19"/>
-        </w:rPr>
-        <w:t xml:space="preserve">Estimate and contractor pricing reviews at each design issuance through 100% Design Development (test fit, schematic, and 100% DD)</w:t>
+          <w:b/>
+          <w:rFonts w:ascii="Calibri Light" w:hAnsi="Calibri Light" w:cs="Calibri Light"/>
+          <w:sz w:val="19"/>
+          <w:szCs w:val="19"/>
+        </w:rPr>
+        <w:t xml:space="preserve">Phase 1 – </w:t>
+      </w:r>
+      <w:r>
+        <w:rPr>
+          <w:rFonts w:ascii="Calibri Light" w:hAnsi="Calibri Light" w:cs="Calibri Light"/>
+          <w:sz w:val="19"/>
+          <w:szCs w:val="19"/>
+        </w:rPr>
+        <w:t xml:space="preserve">Estimate and contractor pricing reviews at each design issuance through 100% Design Development (test fit, schematic, and 100% DD), pricing the cost effect of each DCAS comment round.</w:t>
       </w:r>
     </w:p>
     <w:p>
@@ -884,11 +1396,20 @@
       </w:pPr>
       <w:r>
         <w:rPr>
-          <w:rFonts w:ascii="Calibri Light" w:hAnsi="Calibri Light" w:cs="Calibri Light"/>
-          <w:sz w:val="19"/>
-          <w:szCs w:val="19"/>
-        </w:rPr>
-        <w:t xml:space="preserve">Bid package leveling with recommendation matrices – scope completeness, exclusions, commercial risks, and MWBE participation tracking – for eight packages including the design team procurement</w:t>
+          <w:b/>
+          <w:rFonts w:ascii="Calibri Light" w:hAnsi="Calibri Light" w:cs="Calibri Light"/>
+          <w:sz w:val="19"/>
+          <w:szCs w:val="19"/>
+        </w:rPr>
+        <w:t xml:space="preserve">Phase 1 – </w:t>
+      </w:r>
+      <w:r>
+        <w:rPr>
+          <w:rFonts w:ascii="Calibri Light" w:hAnsi="Calibri Light" w:cs="Calibri Light"/>
+          <w:sz w:val="19"/>
+          <w:szCs w:val="19"/>
+        </w:rPr>
+        <w:t xml:space="preserve">Bid leveling and recommendation matrices for the design team procurement and one early package, including MWBE participation.</w:t>
       </w:r>
     </w:p>
     <w:p>
@@ -907,11 +1428,20 @@
       </w:pPr>
       <w:r>
         <w:rPr>
-          <w:rFonts w:ascii="Calibri Light" w:hAnsi="Calibri Light" w:cs="Calibri Light"/>
-          <w:sz w:val="19"/>
-          <w:szCs w:val="19"/>
-        </w:rPr>
-        <w:t xml:space="preserve">Monthly cost report and cost-to-complete forecast: commitments, expenditures, variances, trends, and contingency tracking, with per-bucket breakouts</w:t>
+          <w:b/>
+          <w:rFonts w:ascii="Calibri Light" w:hAnsi="Calibri Light" w:cs="Calibri Light"/>
+          <w:sz w:val="19"/>
+          <w:szCs w:val="19"/>
+        </w:rPr>
+        <w:t xml:space="preserve">Phase 1 – </w:t>
+      </w:r>
+      <w:r>
+        <w:rPr>
+          <w:rFonts w:ascii="Calibri Light" w:hAnsi="Calibri Light" w:cs="Calibri Light"/>
+          <w:sz w:val="19"/>
+          <w:szCs w:val="19"/>
+        </w:rPr>
+        <w:t xml:space="preserve">Monthly cost report and cost-to-complete forecast, monthly owner cost meeting, and a reconciled per-bucket budget for BGRE’s termination-option decision at 100% DD.</w:t>
       </w:r>
     </w:p>
     <w:p>
@@ -930,11 +1460,20 @@
       </w:pPr>
       <w:r>
         <w:rPr>
-          <w:rFonts w:ascii="Calibri Light" w:hAnsi="Calibri Light" w:cs="Calibri Light"/>
-          <w:sz w:val="19"/>
-          <w:szCs w:val="19"/>
-        </w:rPr>
-        <w:t xml:space="preserve">Change order review: pricing verification, entitlement, alternatives, and cost-saving opportunities; maintenance of change and commitment logs</w:t>
+          <w:b/>
+          <w:rFonts w:ascii="Calibri Light" w:hAnsi="Calibri Light" w:cs="Calibri Light"/>
+          <w:sz w:val="19"/>
+          <w:szCs w:val="19"/>
+        </w:rPr>
+        <w:t xml:space="preserve">Phase 2 – </w:t>
+      </w:r>
+      <w:r>
+        <w:rPr>
+          <w:rFonts w:ascii="Calibri Light" w:hAnsi="Calibri Light" w:cs="Calibri Light"/>
+          <w:sz w:val="19"/>
+          <w:szCs w:val="19"/>
+        </w:rPr>
+        <w:t xml:space="preserve">Bid leveling and recommendation matrices for six trade / GMP packages, normalizing scope, exclusions, general conditions, logistics, and MWBE participation across bidders.</w:t>
       </w:r>
     </w:p>
     <w:p>
@@ -953,11 +1492,20 @@
       </w:pPr>
       <w:r>
         <w:rPr>
-          <w:rFonts w:ascii="Calibri Light" w:hAnsi="Calibri Light" w:cs="Calibri Light"/>
-          <w:sz w:val="19"/>
-          <w:szCs w:val="19"/>
-        </w:rPr>
-        <w:t xml:space="preserve">Monthly owner cost meeting and Director-level oversight of the cost workstream throughout the term</w:t>
+          <w:b/>
+          <w:rFonts w:ascii="Calibri Light" w:hAnsi="Calibri Light" w:cs="Calibri Light"/>
+          <w:sz w:val="19"/>
+          <w:szCs w:val="19"/>
+        </w:rPr>
+        <w:t xml:space="preserve">Phase 2 – </w:t>
+      </w:r>
+      <w:r>
+        <w:rPr>
+          <w:rFonts w:ascii="Calibri Light" w:hAnsi="Calibri Light" w:cs="Calibri Light"/>
+          <w:sz w:val="19"/>
+          <w:szCs w:val="19"/>
+        </w:rPr>
+        <w:t xml:space="preserve">Monthly cost report and cost-to-complete forecast with per-bucket breakouts, contingency drawdown tracking, and the exposure register of pending and potential changes.</w:t>
       </w:r>
     </w:p>
     <w:p>
@@ -976,11 +1524,84 @@
       </w:pPr>
       <w:r>
         <w:rPr>
-          <w:rFonts w:ascii="Calibri Light" w:hAnsi="Calibri Light" w:cs="Calibri Light"/>
-          <w:sz w:val="19"/>
-          <w:szCs w:val="19"/>
-        </w:rPr>
-        <w:t xml:space="preserve">Final cost reconciliation and closeout cost report for each asset-improvement bucket</w:t>
+          <w:b/>
+          <w:rFonts w:ascii="Calibri Light" w:hAnsi="Calibri Light" w:cs="Calibri Light"/>
+          <w:sz w:val="19"/>
+          <w:szCs w:val="19"/>
+        </w:rPr>
+        <w:t xml:space="preserve">Phase 2 – </w:t>
+      </w:r>
+      <w:r>
+        <w:rPr>
+          <w:rFonts w:ascii="Calibri Light" w:hAnsi="Calibri Light" w:cs="Calibri Light"/>
+          <w:sz w:val="19"/>
+          <w:szCs w:val="19"/>
+        </w:rPr>
+        <w:t xml:space="preserve">Change order review: entitlement, pricing verification, schedule implication, alternatives, and cumulative impact, with change and commitment logs maintained continuously.</w:t>
+      </w:r>
+    </w:p>
+    <w:p>
+      <w:pPr>
+        <w:pStyle w:val="ListParagraph"/>
+        <w:numPr>
+          <w:ilvl w:val="0"/>
+          <w:numId w:val="2"/>
+        </w:numPr>
+        <w:spacing w:line="360" w:lineRule="auto"/>
+        <w:rPr>
+          <w:rFonts w:ascii="Calibri Light" w:hAnsi="Calibri Light" w:cs="Calibri Light"/>
+          <w:sz w:val="19"/>
+          <w:szCs w:val="19"/>
+        </w:rPr>
+      </w:pPr>
+      <w:r>
+        <w:rPr>
+          <w:b/>
+          <w:rFonts w:ascii="Calibri Light" w:hAnsi="Calibri Light" w:cs="Calibri Light"/>
+          <w:sz w:val="19"/>
+          <w:szCs w:val="19"/>
+        </w:rPr>
+        <w:t xml:space="preserve">Phase 2 – </w:t>
+      </w:r>
+      <w:r>
+        <w:rPr>
+          <w:rFonts w:ascii="Calibri Light" w:hAnsi="Calibri Light" w:cs="Calibri Light"/>
+          <w:sz w:val="19"/>
+          <w:szCs w:val="19"/>
+        </w:rPr>
+        <w:t xml:space="preserve">Monthly owner cost meeting and Director-level oversight throughout construction, with executive cost summaries suitable for asset management and investment reporting.</w:t>
+      </w:r>
+    </w:p>
+    <w:p>
+      <w:pPr>
+        <w:pStyle w:val="ListParagraph"/>
+        <w:numPr>
+          <w:ilvl w:val="0"/>
+          <w:numId w:val="2"/>
+        </w:numPr>
+        <w:spacing w:line="360" w:lineRule="auto"/>
+        <w:rPr>
+          <w:rFonts w:ascii="Calibri Light" w:hAnsi="Calibri Light" w:cs="Calibri Light"/>
+          <w:sz w:val="19"/>
+          <w:szCs w:val="19"/>
+        </w:rPr>
+      </w:pPr>
+      <w:r>
+        <w:rPr>
+          <w:b/>
+          <w:rFonts w:ascii="Calibri Light" w:hAnsi="Calibri Light" w:cs="Calibri Light"/>
+          <w:sz w:val="19"/>
+          <w:szCs w:val="19"/>
+        </w:rPr>
+        <w:t xml:space="preserve">Phase 2 – </w:t>
+      </w:r>
+      <w:r>
+        <w:rPr>
+          <w:rFonts w:ascii="Calibri Light" w:hAnsi="Calibri Light" w:cs="Calibri Light"/>
+          <w:sz w:val="19"/>
+          <w:szCs w:val="19"/>
+        </w:rPr>
+        <w:t xml:space="preserve">Final cost reconciliation and closeout cost report for each bucket, including final contingency and allowance reconciliation and lessons learned on cost.</w:t>
       </w:r>
     </w:p>
     <w:p>
@@ -1039,39 +1660,146 @@
           <w:sz w:val="19"/>
           <w:szCs w:val="19"/>
         </w:rPr>
-        <w:t xml:space="preserve">For the above outlined scope of cost management services, we propose a total lump sum fee of $335,583 for the 38-month term, structured to match the Owner’s termination option: $82,260 through 100% Design Development (October 2026 – March 2027), and $253,323 for construction through closeout (March 2027 – December 2029). Should the Owner exercise the termination option at 100% DDs, only the first-phase fee applies. The fee is built bottom-up on escalated hourly rates by contract year (5% at each anniversary), not flat year-one rates, and is invoiced monthly against progress. For the Owner’s cost coding, we propose allocating the fee 55% / 20% / 25% across the 100 Gold Tenant Fitout &amp; Demo/LLW, the Demo/LLW/Whitebox balance, and the Base Building Capital Improvements respectively; Bucket 4 (tenant relocation coordination) is excluded from this scope. Additional services – including independent detailed milestone estimates, MWBE compliance monitoring, tenant relocation cost analysis, or additional bid package levelings – can be provided at the hourly rates attached or as an agreed lump sum.</w:t>
-      </w:r>
-    </w:p>
-    <w:p>
-      <w:pPr>
-        <w:spacing w:line="240" w:lineRule="atLeast"/>
-        <w:rPr>
-          <w:rFonts w:ascii="Calibri Light" w:hAnsi="Calibri Light" w:cs="Calibri Light"/>
-          <w:sz w:val="19"/>
-          <w:szCs w:val="19"/>
-        </w:rPr>
-      </w:pPr>
-    </w:p>
-    <w:p>
-      <w:pPr>
-        <w:spacing w:line="240" w:lineRule="atLeast"/>
-        <w:rPr>
-          <w:rFonts w:ascii="Calibri Light" w:hAnsi="Calibri Light" w:cs="Calibri Light"/>
-          <w:sz w:val="19"/>
-          <w:szCs w:val="19"/>
-        </w:rPr>
-      </w:pPr>
-    </w:p>
-    <w:p>
-      <w:pPr>
-        <w:rPr>
-          <w:rFonts w:ascii="Calibri Light" w:hAnsi="Calibri Light" w:cs="Calibri Light"/>
-          <w:sz w:val="19"/>
-          <w:szCs w:val="19"/>
-        </w:rPr>
-      </w:pPr>
+        <w:t xml:space="preserve">For the scope of cost management services above, we propose a total lump sum fee of $335,583 for the 38-month term, structured to the Owner’s termination option so that BGRE only ever pays for the phase it is in:</w:t>
+      </w:r>
+    </w:p>
+    <w:p>
+      <w:pPr>
+        <w:pStyle w:val="ListParagraph"/>
+        <w:numPr>
+          <w:ilvl w:val="0"/>
+          <w:numId w:val="103"/>
+        </w:numPr>
+        <w:spacing w:line="240" w:lineRule="atLeast"/>
+        <w:rPr>
+          <w:rFonts w:ascii="Calibri Light" w:hAnsi="Calibri Light" w:cs="Calibri Light"/>
+          <w:sz w:val="19"/>
+          <w:szCs w:val="19"/>
+        </w:rPr>
+      </w:pPr>
+      <w:r>
+        <w:rPr>
+          <w:rFonts w:ascii="Calibri Light" w:hAnsi="Calibri Light" w:cs="Calibri Light"/>
+          <w:sz w:val="19"/>
+          <w:szCs w:val="19"/>
+        </w:rPr>
+        <w:t xml:space="preserve">Phase 1 – Cost management through 100% Design Development (October 2026 – March 2027, Owner termination option) – </w:t>
+      </w:r>
+      <w:r>
+        <w:rPr>
+          <w:b/>
+          <w:rFonts w:ascii="Calibri Light" w:hAnsi="Calibri Light" w:cs="Calibri Light"/>
+          <w:sz w:val="19"/>
+          <w:szCs w:val="19"/>
+        </w:rPr>
+        <w:t xml:space="preserve">$82,260 lump sum</w:t>
+      </w:r>
+    </w:p>
+    <w:p>
+      <w:pPr>
+        <w:pStyle w:val="ListParagraph"/>
+        <w:numPr>
+          <w:ilvl w:val="0"/>
+          <w:numId w:val="103"/>
+        </w:numPr>
+        <w:spacing w:line="240" w:lineRule="atLeast"/>
+        <w:rPr>
+          <w:rFonts w:ascii="Calibri Light" w:hAnsi="Calibri Light" w:cs="Calibri Light"/>
+          <w:sz w:val="19"/>
+          <w:szCs w:val="19"/>
+        </w:rPr>
+      </w:pPr>
+      <w:r>
+        <w:rPr>
+          <w:rFonts w:ascii="Calibri Light" w:hAnsi="Calibri Light" w:cs="Calibri Light"/>
+          <w:sz w:val="19"/>
+          <w:szCs w:val="19"/>
+        </w:rPr>
+        <w:t xml:space="preserve">Phase 2 – Cost management, construction through closeout (March 2027 – December 2029) – </w:t>
+      </w:r>
+      <w:r>
+        <w:rPr>
+          <w:b/>
+          <w:rFonts w:ascii="Calibri Light" w:hAnsi="Calibri Light" w:cs="Calibri Light"/>
+          <w:sz w:val="19"/>
+          <w:szCs w:val="19"/>
+        </w:rPr>
+        <w:t xml:space="preserve">$253,323 lump sum</w:t>
+      </w:r>
+    </w:p>
+    <w:p>
+      <w:pPr>
+        <w:pStyle w:val="ListParagraph"/>
+        <w:numPr>
+          <w:ilvl w:val="0"/>
+          <w:numId w:val="103"/>
+        </w:numPr>
+        <w:spacing w:line="240" w:lineRule="atLeast"/>
+        <w:rPr>
+          <w:rFonts w:ascii="Calibri Light" w:hAnsi="Calibri Light" w:cs="Calibri Light"/>
+          <w:sz w:val="19"/>
+          <w:szCs w:val="19"/>
+        </w:rPr>
+      </w:pPr>
+      <w:r>
+        <w:rPr>
+          <w:rFonts w:ascii="Calibri Light" w:hAnsi="Calibri Light" w:cs="Calibri Light"/>
+          <w:sz w:val="19"/>
+          <w:szCs w:val="19"/>
+        </w:rPr>
+        <w:t xml:space="preserve">Total lump sum fee, 38-month term – </w:t>
+      </w:r>
+      <w:r>
+        <w:rPr>
+          <w:b/>
+          <w:rFonts w:ascii="Calibri Light" w:hAnsi="Calibri Light" w:cs="Calibri Light"/>
+          <w:sz w:val="19"/>
+          <w:szCs w:val="19"/>
+        </w:rPr>
+        <w:t xml:space="preserve">$335,583</w:t>
+      </w:r>
     </w:p>
     <w:p/>
+    <w:p>
+      <w:pPr>
+        <w:spacing w:line="240" w:lineRule="atLeast"/>
+        <w:outlineLvl w:val="0"/>
+        <w:rPr>
+          <w:rFonts w:ascii="Calibri Light" w:hAnsi="Calibri Light" w:cs="Calibri Light"/>
+          <w:bCs/>
+          <w:sz w:val="19"/>
+          <w:szCs w:val="19"/>
+        </w:rPr>
+      </w:pPr>
+      <w:r>
+        <w:rPr>
+          <w:rFonts w:ascii="Calibri Light" w:hAnsi="Calibri Light" w:cs="Calibri Light"/>
+          <w:sz w:val="19"/>
+          <w:szCs w:val="19"/>
+        </w:rPr>
+        <w:t xml:space="preserve">Should the Owner exercise the termination option at 100% DDs, only the Phase 1 fee applies. The fee is built bottom-up from hours by role by deliverable at the attached hourly rates, escalated 5% at each contract anniversary per our standard terms – priced to the actual contract years rather than at flat year-one rates – and is invoiced monthly against progress. For the Owner’s cost coding, we propose allocating the fee 55% / 20% / 25% across the 100 Gold Tenant Fitout &amp; Demo/LLW, the Demo/LLW/Whitebox balance, and the Base Building Capital Improvements respectively. Bucket 4 (coordination of existing tenant relocations) is outside this cost management scope; tenant buyout and relocation cost analysis is available as an additional service. No travel, lodging, printing, technology, or subconsultant costs are anticipated within the base fee; reimbursable expenses, if any, are billed at cost with no markup. Additional services beyond the base scope are provided at the attached hourly rates or as an agreed lump sum.</w:t>
+      </w:r>
+    </w:p>
+    <w:p>
+      <w:pPr>
+        <w:spacing w:line="240" w:lineRule="atLeast"/>
+        <w:rPr>
+          <w:rFonts w:ascii="Calibri Light" w:hAnsi="Calibri Light" w:cs="Calibri Light"/>
+          <w:sz w:val="19"/>
+          <w:szCs w:val="19"/>
+        </w:rPr>
+      </w:pPr>
+    </w:p>
+    <w:p>
+      <w:pPr>
+        <w:spacing w:line="240" w:lineRule="atLeast"/>
+        <w:rPr>
+          <w:rFonts w:ascii="Calibri Light" w:hAnsi="Calibri Light" w:cs="Calibri Light"/>
+          <w:sz w:val="19"/>
+          <w:szCs w:val="19"/>
+        </w:rPr>
+      </w:pPr>
+    </w:p>
     <w:p>
       <w:pPr>
         <w:spacing w:line="240" w:lineRule="atLeast"/>
@@ -1829,7 +2557,7 @@
           <w:sz w:val="19"/>
           <w:szCs w:val="19"/>
         </w:rPr>
-        <w:t>We look forward to working with you and the rest of the project team on this exciting project.  Should you have any questions or comments with regard to any aspect of the proposal, please do not hesitate to contact me.</w:t>
+        <w:t xml:space="preserve">We are available to mobilize the cost team within two weeks of award, ahead of the October 19, 2026 design and construction start, and this proposal remains valid for 90 days from submission as the RFP requires. We would welcome the opportunity to walk BGRE through our monthly cost report format and the Phase 1 termination-gate deliverable in person. Should you have any questions regarding any aspect of this proposal, please contact me directly.</w:t>
       </w:r>
     </w:p>
     <w:p>
@@ -1860,6 +2588,7 @@
         <w:t xml:space="preserve">Sincerely yours,</w:t>
       </w:r>
     </w:p>
+    <w:p/>
     <w:p>
       <w:pPr>
         <w:spacing w:line="240" w:lineRule="atLeast"/>
@@ -1915,16 +2644,6 @@
           <w:szCs w:val="19"/>
         </w:rPr>
       </w:pPr>
-    </w:p>
-    <w:p>
-      <w:pPr>
-        <w:spacing w:line="240" w:lineRule="atLeast"/>
-        <w:rPr>
-          <w:rFonts w:ascii="Calibri Light" w:hAnsi="Calibri Light" w:cs="Calibri Light"/>
-          <w:sz w:val="19"/>
-          <w:szCs w:val="19"/>
-        </w:rPr>
-      </w:pPr>
       <w:r>
         <w:rPr>
           <w:rFonts w:ascii="Calibri Light" w:hAnsi="Calibri Light" w:cs="Calibri Light"/>
@@ -1942,6 +2661,7 @@
         <w:t>Signature: ____________________________</w:t>
       </w:r>
     </w:p>
+    <w:p/>
     <w:p>
       <w:pPr>
         <w:spacing w:line="240" w:lineRule="atLeast"/>
@@ -3891,7 +4611,16 @@
   <w:num w:numId="2" w16cid:durableId="1599174626">
     <w:abstractNumId w:val="3"/>
   </w:num>
+  <w:num w:numId="102" w16cid:durableId="1599174626">
+    <w:abstractNumId w:val="3"/>
+  </w:num>
   <w:num w:numId="3" w16cid:durableId="1999141673">
+    <w:abstractNumId w:val="1"/>
+    <w:lvlOverride w:ilvl="0">
+      <w:startOverride w:val="1"/>
+    </w:lvlOverride>
+  </w:num>
+  <w:num w:numId="103" w16cid:durableId="1999141673">
     <w:abstractNumId w:val="1"/>
     <w:lvlOverride w:ilvl="0">
       <w:startOverride w:val="1"/>

</xml_diff>